<commit_message>
Finished Written Report for Lab 2
</commit_message>
<xml_diff>
--- a/Characterizing the Atmosphere/Lab Report Pressure 263.docx
+++ b/Characterizing the Atmosphere/Lab Report Pressure 263.docx
@@ -2004,6 +2004,9 @@
         <w:jc w:val="center"/>
       </w:pPr>
       <w:r>
+        <w:rPr>
+          <w:noProof/>
+        </w:rPr>
         <w:drawing>
           <wp:inline distT="0" distB="0" distL="0" distR="0" wp14:anchorId="6D5AFCC5" wp14:editId="018986BE">
             <wp:extent cx="4043567" cy="2516429"/>
@@ -2117,6 +2120,9 @@
         <w:jc w:val="center"/>
       </w:pPr>
       <w:r>
+        <w:rPr>
+          <w:noProof/>
+        </w:rPr>
         <w:drawing>
           <wp:inline distT="0" distB="0" distL="0" distR="0" wp14:anchorId="45E360CA" wp14:editId="43DA38F2">
             <wp:extent cx="3176959" cy="2425147"/>
@@ -5000,6 +5006,7 @@
   <w:style w:type="character" w:default="1" w:styleId="DefaultParagraphFont">
     <w:name w:val="Default Paragraph Font"/>
     <w:uiPriority w:val="1"/>
+    <w:semiHidden/>
     <w:unhideWhenUsed/>
   </w:style>
   <w:style w:type="table" w:default="1" w:styleId="TableNormal">
@@ -5641,6 +5648,23 @@
 </file>
 
 <file path=customXml/item1.xml><?xml version="1.0" encoding="utf-8"?>
+<p:properties xmlns:p="http://schemas.microsoft.com/office/2006/metadata/properties" xmlns:xsi="http://www.w3.org/2001/XMLSchema-instance" xmlns:pc="http://schemas.microsoft.com/office/infopath/2007/PartnerControls">
+  <documentManagement>
+    <_activity xmlns="c64525cb-669c-474a-bb1c-a1df3ff42bd0" xsi:nil="true"/>
+  </documentManagement>
+</p:properties>
+</file>
+
+<file path=customXml/item2.xml><?xml version="1.0" encoding="utf-8"?>
+<?mso-contentType ?>
+<FormTemplates xmlns="http://schemas.microsoft.com/sharepoint/v3/contenttype/forms">
+  <Display>DocumentLibraryForm</Display>
+  <Edit>DocumentLibraryForm</Edit>
+  <New>DocumentLibraryForm</New>
+</FormTemplates>
+</file>
+
+<file path=customXml/item3.xml><?xml version="1.0" encoding="utf-8"?>
 <ct:contentTypeSchema xmlns:ct="http://schemas.microsoft.com/office/2006/metadata/contentType" xmlns:ma="http://schemas.microsoft.com/office/2006/metadata/properties/metaAttributes" ct:_="" ma:_="" ma:contentTypeName="Document" ma:contentTypeID="0x010100300CEFF5852D694286F2BC0CE7A6C997" ma:contentTypeVersion="6" ma:contentTypeDescription="Create a new document." ma:contentTypeScope="" ma:versionID="526a12cdb4104c8474d1a1c7b98d28ce">
   <xsd:schema xmlns:xsd="http://www.w3.org/2001/XMLSchema" xmlns:xs="http://www.w3.org/2001/XMLSchema" xmlns:p="http://schemas.microsoft.com/office/2006/metadata/properties" xmlns:ns3="c64525cb-669c-474a-bb1c-a1df3ff42bd0" targetNamespace="http://schemas.microsoft.com/office/2006/metadata/properties" ma:root="true" ma:fieldsID="bbbd96e4c2bf71238f876c69fa445afd" ns3:_="">
     <xsd:import namespace="c64525cb-669c-474a-bb1c-a1df3ff42bd0"/>
@@ -5796,24 +5820,25 @@
 </ct:contentTypeSchema>
 </file>
 
-<file path=customXml/item2.xml><?xml version="1.0" encoding="utf-8"?>
-<?mso-contentType ?>
-<FormTemplates xmlns="http://schemas.microsoft.com/sharepoint/v3/contenttype/forms">
-  <Display>DocumentLibraryForm</Display>
-  <Edit>DocumentLibraryForm</Edit>
-  <New>DocumentLibraryForm</New>
-</FormTemplates>
+<file path=customXml/itemProps1.xml><?xml version="1.0" encoding="utf-8"?>
+<ds:datastoreItem xmlns:ds="http://schemas.openxmlformats.org/officeDocument/2006/customXml" ds:itemID="{EC1935FD-CA12-4FA6-BF07-F92D2593133B}">
+  <ds:schemaRefs>
+    <ds:schemaRef ds:uri="http://schemas.microsoft.com/office/2006/metadata/properties"/>
+    <ds:schemaRef ds:uri="http://schemas.microsoft.com/office/infopath/2007/PartnerControls"/>
+    <ds:schemaRef ds:uri="c64525cb-669c-474a-bb1c-a1df3ff42bd0"/>
+  </ds:schemaRefs>
+</ds:datastoreItem>
 </file>
 
-<file path=customXml/item3.xml><?xml version="1.0" encoding="utf-8"?>
-<p:properties xmlns:p="http://schemas.microsoft.com/office/2006/metadata/properties" xmlns:xsi="http://www.w3.org/2001/XMLSchema-instance" xmlns:pc="http://schemas.microsoft.com/office/infopath/2007/PartnerControls">
-  <documentManagement>
-    <_activity xmlns="c64525cb-669c-474a-bb1c-a1df3ff42bd0" xsi:nil="true"/>
-  </documentManagement>
-</p:properties>
+<file path=customXml/itemProps2.xml><?xml version="1.0" encoding="utf-8"?>
+<ds:datastoreItem xmlns:ds="http://schemas.openxmlformats.org/officeDocument/2006/customXml" ds:itemID="{86C74CF0-A07E-4067-9665-B6C056EE9190}">
+  <ds:schemaRefs>
+    <ds:schemaRef ds:uri="http://schemas.microsoft.com/sharepoint/v3/contenttype/forms"/>
+  </ds:schemaRefs>
+</ds:datastoreItem>
 </file>
 
-<file path=customXml/itemProps1.xml><?xml version="1.0" encoding="utf-8"?>
+<file path=customXml/itemProps3.xml><?xml version="1.0" encoding="utf-8"?>
 <ds:datastoreItem xmlns:ds="http://schemas.openxmlformats.org/officeDocument/2006/customXml" ds:itemID="{FB21964B-CBED-4734-8C8E-A3F91E57A809}">
   <ds:schemaRefs>
     <ds:schemaRef ds:uri="http://schemas.microsoft.com/office/2006/metadata/contentType"/>
@@ -5829,22 +5854,4 @@
     <ds:schemaRef ds:uri="http://schemas.microsoft.com/internal/obd"/>
   </ds:schemaRefs>
 </ds:datastoreItem>
-</file>
-
-<file path=customXml/itemProps2.xml><?xml version="1.0" encoding="utf-8"?>
-<ds:datastoreItem xmlns:ds="http://schemas.openxmlformats.org/officeDocument/2006/customXml" ds:itemID="{86C74CF0-A07E-4067-9665-B6C056EE9190}">
-  <ds:schemaRefs>
-    <ds:schemaRef ds:uri="http://schemas.microsoft.com/sharepoint/v3/contenttype/forms"/>
-  </ds:schemaRefs>
-</ds:datastoreItem>
-</file>
-
-<file path=customXml/itemProps3.xml><?xml version="1.0" encoding="utf-8"?>
-<ds:datastoreItem xmlns:ds="http://schemas.openxmlformats.org/officeDocument/2006/customXml" ds:itemID="{EC1935FD-CA12-4FA6-BF07-F92D2593133B}">
-  <ds:schemaRefs>
-    <ds:schemaRef ds:uri="http://schemas.microsoft.com/office/2006/metadata/properties"/>
-    <ds:schemaRef ds:uri="http://schemas.microsoft.com/office/infopath/2007/PartnerControls"/>
-    <ds:schemaRef ds:uri="c64525cb-669c-474a-bb1c-a1df3ff42bd0"/>
-  </ds:schemaRefs>
-</ds:datastoreItem>
 </file>
</xml_diff>